<commit_message>
Limit exam to 4 pages, remove answer key, add circle symbols for MC answers
</commit_message>
<xml_diff>
--- a/ScikitImage_Examination.docx
+++ b/ScikitImage_Examination.docx
@@ -56,7 +56,7 @@
     </w:p>
     <w:p>
       <w:pPr>
-        <w:spacing w:after="240"/>
+        <w:spacing w:after="120"/>
       </w:pPr>
       <w:r>
         <w:rPr>
@@ -69,7 +69,7 @@
     </w:p>
     <w:p>
       <w:pPr>
-        <w:spacing w:after="40"/>
+        <w:spacing w:after="40" w:before="80"/>
       </w:pPr>
       <w:r>
         <w:rPr>
@@ -89,7 +89,7 @@
           <w:rFonts w:ascii="Times New Roman" w:hAnsi="Times New Roman"/>
           <w:sz w:val="24"/>
         </w:rPr>
-        <w:t>A. skimage</w:t>
+        <w:t>○  A. skimage</w:t>
       </w:r>
     </w:p>
     <w:p>
@@ -102,7 +102,7 @@
           <w:rFonts w:ascii="Times New Roman" w:hAnsi="Times New Roman"/>
           <w:sz w:val="24"/>
         </w:rPr>
-        <w:t>B. sklearn</w:t>
+        <w:t>○  B. sklearn</w:t>
       </w:r>
     </w:p>
     <w:p>
@@ -115,7 +115,7 @@
           <w:rFonts w:ascii="Times New Roman" w:hAnsi="Times New Roman"/>
           <w:sz w:val="24"/>
         </w:rPr>
-        <w:t>C. skimg</w:t>
+        <w:t>○  C. skimg</w:t>
       </w:r>
     </w:p>
     <w:p>
@@ -128,7 +128,7 @@
           <w:rFonts w:ascii="Times New Roman" w:hAnsi="Times New Roman"/>
           <w:sz w:val="24"/>
         </w:rPr>
-        <w:t>D. scikit</w:t>
+        <w:t>○  D. scikit</w:t>
       </w:r>
     </w:p>
     <w:p>
@@ -138,7 +138,7 @@
     </w:p>
     <w:p>
       <w:pPr>
-        <w:spacing w:after="40"/>
+        <w:spacing w:after="40" w:before="80"/>
       </w:pPr>
       <w:r>
         <w:rPr>
@@ -158,7 +158,7 @@
           <w:rFonts w:ascii="Times New Roman" w:hAnsi="Times New Roman"/>
           <w:sz w:val="24"/>
         </w:rPr>
-        <w:t>A. Pandas and Matplotlib</w:t>
+        <w:t>○  A. Pandas and Matplotlib</w:t>
       </w:r>
     </w:p>
     <w:p>
@@ -171,7 +171,7 @@
           <w:rFonts w:ascii="Times New Roman" w:hAnsi="Times New Roman"/>
           <w:sz w:val="24"/>
         </w:rPr>
-        <w:t>B. NumPy and SciPy.ndimage</w:t>
+        <w:t>○  B. NumPy and SciPy.ndimage</w:t>
       </w:r>
     </w:p>
     <w:p>
@@ -184,7 +184,7 @@
           <w:rFonts w:ascii="Times New Roman" w:hAnsi="Times New Roman"/>
           <w:sz w:val="24"/>
         </w:rPr>
-        <w:t>C. TensorFlow and Keras</w:t>
+        <w:t>○  C. TensorFlow and Keras</w:t>
       </w:r>
     </w:p>
     <w:p>
@@ -197,7 +197,7 @@
           <w:rFonts w:ascii="Times New Roman" w:hAnsi="Times New Roman"/>
           <w:sz w:val="24"/>
         </w:rPr>
-        <w:t>D. OpenCV and Pillow</w:t>
+        <w:t>○  D. OpenCV and Pillow</w:t>
       </w:r>
     </w:p>
     <w:p>
@@ -207,7 +207,7 @@
     </w:p>
     <w:p>
       <w:pPr>
-        <w:spacing w:after="40"/>
+        <w:spacing w:after="40" w:before="80"/>
       </w:pPr>
       <w:r>
         <w:rPr>
@@ -227,7 +227,7 @@
           <w:rFonts w:ascii="Times New Roman" w:hAnsi="Times New Roman"/>
           <w:sz w:val="24"/>
         </w:rPr>
-        <w:t>A. As Python lists</w:t>
+        <w:t>○  A. As Python lists</w:t>
       </w:r>
     </w:p>
     <w:p>
@@ -240,7 +240,7 @@
           <w:rFonts w:ascii="Times New Roman" w:hAnsi="Times New Roman"/>
           <w:sz w:val="24"/>
         </w:rPr>
-        <w:t>B. As NumPy ndarrays</w:t>
+        <w:t>○  B. As NumPy ndarrays</w:t>
       </w:r>
     </w:p>
     <w:p>
@@ -253,7 +253,7 @@
           <w:rFonts w:ascii="Times New Roman" w:hAnsi="Times New Roman"/>
           <w:sz w:val="24"/>
         </w:rPr>
-        <w:t>C. As PIL Image objects</w:t>
+        <w:t>○  C. As PIL Image objects</w:t>
       </w:r>
     </w:p>
     <w:p>
@@ -266,7 +266,7 @@
           <w:rFonts w:ascii="Times New Roman" w:hAnsi="Times New Roman"/>
           <w:sz w:val="24"/>
         </w:rPr>
-        <w:t>D. As OpenCV matrices</w:t>
+        <w:t>○  D. As OpenCV matrices</w:t>
       </w:r>
     </w:p>
     <w:p>
@@ -276,7 +276,7 @@
     </w:p>
     <w:p>
       <w:pPr>
-        <w:spacing w:after="40"/>
+        <w:spacing w:after="40" w:before="80"/>
       </w:pPr>
       <w:r>
         <w:rPr>
@@ -296,7 +296,7 @@
           <w:rFonts w:ascii="Times New Roman" w:hAnsi="Times New Roman"/>
           <w:sz w:val="24"/>
         </w:rPr>
-        <w:t>A. It is an open-source package</w:t>
+        <w:t>○  A. It is an open-source package</w:t>
       </w:r>
     </w:p>
     <w:p>
@@ -309,7 +309,7 @@
           <w:rFonts w:ascii="Times New Roman" w:hAnsi="Times New Roman"/>
           <w:sz w:val="24"/>
         </w:rPr>
-        <w:t>B. It can read and write images of various formats</w:t>
+        <w:t>○  B. It can read and write images of various formats</w:t>
       </w:r>
     </w:p>
     <w:p>
@@ -322,7 +322,7 @@
           <w:rFonts w:ascii="Times New Roman" w:hAnsi="Times New Roman"/>
           <w:sz w:val="24"/>
         </w:rPr>
-        <w:t>C. It provides deep learning models for image classification</w:t>
+        <w:t>○  C. It provides deep learning models for image classification</w:t>
       </w:r>
     </w:p>
     <w:p>
@@ -335,7 +335,7 @@
           <w:rFonts w:ascii="Times New Roman" w:hAnsi="Times New Roman"/>
           <w:sz w:val="24"/>
         </w:rPr>
-        <w:t>D. It provides image processing algorithms such as filtering and segmentation</w:t>
+        <w:t>○  D. It provides image processing algorithms such as filtering and segmentation</w:t>
       </w:r>
     </w:p>
     <w:p>
@@ -345,7 +345,7 @@
     </w:p>
     <w:p>
       <w:pPr>
-        <w:spacing w:after="40"/>
+        <w:spacing w:after="40" w:before="80"/>
       </w:pPr>
       <w:r>
         <w:rPr>
@@ -365,7 +365,7 @@
           <w:rFonts w:ascii="Times New Roman" w:hAnsi="Times New Roman"/>
           <w:sz w:val="24"/>
         </w:rPr>
-        <w:t>A. pip install skimage</w:t>
+        <w:t>○  A. pip install skimage</w:t>
       </w:r>
     </w:p>
     <w:p>
@@ -378,7 +378,7 @@
           <w:rFonts w:ascii="Times New Roman" w:hAnsi="Times New Roman"/>
           <w:sz w:val="24"/>
         </w:rPr>
-        <w:t>B. pip install scikit-image</w:t>
+        <w:t>○  B. pip install scikit-image</w:t>
       </w:r>
     </w:p>
     <w:p>
@@ -391,7 +391,7 @@
           <w:rFonts w:ascii="Times New Roman" w:hAnsi="Times New Roman"/>
           <w:sz w:val="24"/>
         </w:rPr>
-        <w:t>C. pip install scikit_image</w:t>
+        <w:t>○  C. pip install scikit_image</w:t>
       </w:r>
     </w:p>
     <w:p>
@@ -404,7 +404,7 @@
           <w:rFonts w:ascii="Times New Roman" w:hAnsi="Times New Roman"/>
           <w:sz w:val="24"/>
         </w:rPr>
-        <w:t>D. pip install sklearn</w:t>
+        <w:t>○  D. pip install sklearn</w:t>
       </w:r>
     </w:p>
     <w:p>
@@ -414,7 +414,7 @@
     </w:p>
     <w:p>
       <w:pPr>
-        <w:spacing w:after="40"/>
+        <w:spacing w:after="40" w:before="80"/>
       </w:pPr>
       <w:r>
         <w:rPr>
@@ -434,7 +434,7 @@
           <w:rFonts w:ascii="Times New Roman" w:hAnsi="Times New Roman"/>
           <w:sz w:val="24"/>
         </w:rPr>
-        <w:t>A. anaconda install scikit-image</w:t>
+        <w:t>○  A. anaconda install scikit-image</w:t>
       </w:r>
     </w:p>
     <w:p>
@@ -447,7 +447,7 @@
           <w:rFonts w:ascii="Times New Roman" w:hAnsi="Times New Roman"/>
           <w:sz w:val="24"/>
         </w:rPr>
-        <w:t>B. pip install scikit-image</w:t>
+        <w:t>○  B. pip install scikit-image</w:t>
       </w:r>
     </w:p>
     <w:p>
@@ -460,7 +460,7 @@
           <w:rFonts w:ascii="Times New Roman" w:hAnsi="Times New Roman"/>
           <w:sz w:val="24"/>
         </w:rPr>
-        <w:t>C. conda install scikit-image</w:t>
+        <w:t>○  C. conda install scikit-image</w:t>
       </w:r>
     </w:p>
     <w:p>
@@ -473,7 +473,7 @@
           <w:rFonts w:ascii="Times New Roman" w:hAnsi="Times New Roman"/>
           <w:sz w:val="24"/>
         </w:rPr>
-        <w:t>D. conda get scikit-image</w:t>
+        <w:t>○  D. conda get scikit-image</w:t>
       </w:r>
     </w:p>
     <w:p>
@@ -483,7 +483,7 @@
     </w:p>
     <w:p>
       <w:pPr>
-        <w:spacing w:after="40"/>
+        <w:spacing w:after="40" w:before="80"/>
       </w:pPr>
       <w:r>
         <w:rPr>
@@ -503,7 +503,7 @@
           <w:rFonts w:ascii="Times New Roman" w:hAnsi="Times New Roman"/>
           <w:sz w:val="24"/>
         </w:rPr>
-        <w:t>A. import scikit_image</w:t>
+        <w:t>○  A. import scikit_image</w:t>
       </w:r>
     </w:p>
     <w:p>
@@ -516,7 +516,7 @@
           <w:rFonts w:ascii="Times New Roman" w:hAnsi="Times New Roman"/>
           <w:sz w:val="24"/>
         </w:rPr>
-        <w:t>B. import skimage</w:t>
+        <w:t>○  B. import skimage</w:t>
       </w:r>
     </w:p>
     <w:p>
@@ -529,7 +529,7 @@
           <w:rFonts w:ascii="Times New Roman" w:hAnsi="Times New Roman"/>
           <w:sz w:val="24"/>
         </w:rPr>
-        <w:t>C. import sklearn</w:t>
+        <w:t>○  C. import sklearn</w:t>
       </w:r>
     </w:p>
     <w:p>
@@ -542,7 +542,7 @@
           <w:rFonts w:ascii="Times New Roman" w:hAnsi="Times New Roman"/>
           <w:sz w:val="24"/>
         </w:rPr>
-        <w:t>D. import scipy.image</w:t>
+        <w:t>○  D. import scipy.image</w:t>
       </w:r>
     </w:p>
     <w:p>
@@ -552,7 +552,7 @@
     </w:p>
     <w:p>
       <w:pPr>
-        <w:spacing w:after="40"/>
+        <w:spacing w:after="40" w:before="80"/>
       </w:pPr>
       <w:r>
         <w:rPr>
@@ -572,7 +572,7 @@
           <w:rFonts w:ascii="Times New Roman" w:hAnsi="Times New Roman"/>
           <w:sz w:val="24"/>
         </w:rPr>
-        <w:t>A. Feature Extraction</w:t>
+        <w:t>○  A. Feature Extraction</w:t>
       </w:r>
     </w:p>
     <w:p>
@@ -585,7 +585,7 @@
           <w:rFonts w:ascii="Times New Roman" w:hAnsi="Times New Roman"/>
           <w:sz w:val="24"/>
         </w:rPr>
-        <w:t>B. Image Filtering</w:t>
+        <w:t>○  B. Image Filtering</w:t>
       </w:r>
     </w:p>
     <w:p>
@@ -598,7 +598,7 @@
           <w:rFonts w:ascii="Times New Roman" w:hAnsi="Times New Roman"/>
           <w:sz w:val="24"/>
         </w:rPr>
-        <w:t>C. Image Segmentation</w:t>
+        <w:t>○  C. Image Segmentation</w:t>
       </w:r>
     </w:p>
     <w:p>
@@ -611,7 +611,7 @@
           <w:rFonts w:ascii="Times New Roman" w:hAnsi="Times New Roman"/>
           <w:sz w:val="24"/>
         </w:rPr>
-        <w:t>D. Classification</w:t>
+        <w:t>○  D. Classification</w:t>
       </w:r>
     </w:p>
     <w:p>
@@ -621,7 +621,7 @@
     </w:p>
     <w:p>
       <w:pPr>
-        <w:spacing w:after="40"/>
+        <w:spacing w:after="40" w:before="80"/>
       </w:pPr>
       <w:r>
         <w:rPr>
@@ -641,7 +641,7 @@
           <w:rFonts w:ascii="Times New Roman" w:hAnsi="Times New Roman"/>
           <w:sz w:val="24"/>
         </w:rPr>
-        <w:t>A. Image Segmentation</w:t>
+        <w:t>○  A. Image Segmentation</w:t>
       </w:r>
     </w:p>
     <w:p>
@@ -654,7 +654,7 @@
           <w:rFonts w:ascii="Times New Roman" w:hAnsi="Times New Roman"/>
           <w:sz w:val="24"/>
         </w:rPr>
-        <w:t>B. Image Filtering</w:t>
+        <w:t>○  B. Image Filtering</w:t>
       </w:r>
     </w:p>
     <w:p>
@@ -667,7 +667,7 @@
           <w:rFonts w:ascii="Times New Roman" w:hAnsi="Times New Roman"/>
           <w:sz w:val="24"/>
         </w:rPr>
-        <w:t>C. Classification</w:t>
+        <w:t>○  C. Classification</w:t>
       </w:r>
     </w:p>
     <w:p>
@@ -680,7 +680,7 @@
           <w:rFonts w:ascii="Times New Roman" w:hAnsi="Times New Roman"/>
           <w:sz w:val="24"/>
         </w:rPr>
-        <w:t>D. Feature Extraction</w:t>
+        <w:t>○  D. Feature Extraction</w:t>
       </w:r>
     </w:p>
     <w:p>
@@ -690,7 +690,7 @@
     </w:p>
     <w:p>
       <w:pPr>
-        <w:spacing w:after="40"/>
+        <w:spacing w:after="40" w:before="80"/>
       </w:pPr>
       <w:r>
         <w:rPr>
@@ -710,7 +710,7 @@
           <w:rFonts w:ascii="Times New Roman" w:hAnsi="Times New Roman"/>
           <w:sz w:val="24"/>
         </w:rPr>
-        <w:t>A. scikit-image</w:t>
+        <w:t>○  A. scikit-image</w:t>
       </w:r>
     </w:p>
     <w:p>
@@ -723,7 +723,7 @@
           <w:rFonts w:ascii="Times New Roman" w:hAnsi="Times New Roman"/>
           <w:sz w:val="24"/>
         </w:rPr>
-        <w:t>B. OpenCV</w:t>
+        <w:t>○  B. OpenCV</w:t>
       </w:r>
     </w:p>
     <w:p>
@@ -736,7 +736,7 @@
           <w:rFonts w:ascii="Times New Roman" w:hAnsi="Times New Roman"/>
           <w:sz w:val="24"/>
         </w:rPr>
-        <w:t>C. TensorFlow</w:t>
+        <w:t>○  C. TensorFlow</w:t>
       </w:r>
     </w:p>
     <w:p>
@@ -749,7 +749,7 @@
           <w:rFonts w:ascii="Times New Roman" w:hAnsi="Times New Roman"/>
           <w:sz w:val="24"/>
         </w:rPr>
-        <w:t>D. Pillow</w:t>
+        <w:t>○  D. Pillow</w:t>
       </w:r>
     </w:p>
     <w:p>
@@ -764,7 +764,7 @@
     </w:p>
     <w:p>
       <w:pPr>
-        <w:spacing w:after="40"/>
+        <w:spacing w:after="40" w:before="80"/>
       </w:pPr>
       <w:r>
         <w:rPr>
@@ -784,7 +784,7 @@
           <w:rFonts w:ascii="Times New Roman" w:hAnsi="Times New Roman"/>
           <w:sz w:val="24"/>
         </w:rPr>
-        <w:t>A. One-dimensional (width)</w:t>
+        <w:t>○  A. One-dimensional (width)</w:t>
       </w:r>
     </w:p>
     <w:p>
@@ -797,7 +797,7 @@
           <w:rFonts w:ascii="Times New Roman" w:hAnsi="Times New Roman"/>
           <w:sz w:val="24"/>
         </w:rPr>
-        <w:t>B. Two-dimensional (height x width)</w:t>
+        <w:t>○  B. Two-dimensional (height x width)</w:t>
       </w:r>
     </w:p>
     <w:p>
@@ -810,7 +810,7 @@
           <w:rFonts w:ascii="Times New Roman" w:hAnsi="Times New Roman"/>
           <w:sz w:val="24"/>
         </w:rPr>
-        <w:t>C. Three-dimensional (height x width x 3)</w:t>
+        <w:t>○  C. Three-dimensional (height x width x 3)</w:t>
       </w:r>
     </w:p>
     <w:p>
@@ -823,7 +823,7 @@
           <w:rFonts w:ascii="Times New Roman" w:hAnsi="Times New Roman"/>
           <w:sz w:val="24"/>
         </w:rPr>
-        <w:t>D. Four-dimensional</w:t>
+        <w:t>○  D. Four-dimensional</w:t>
       </w:r>
     </w:p>
     <w:p>
@@ -833,7 +833,7 @@
     </w:p>
     <w:p>
       <w:pPr>
-        <w:spacing w:after="40"/>
+        <w:spacing w:after="40" w:before="80"/>
       </w:pPr>
       <w:r>
         <w:rPr>
@@ -853,7 +853,7 @@
           <w:rFonts w:ascii="Times New Roman" w:hAnsi="Times New Roman"/>
           <w:sz w:val="24"/>
         </w:rPr>
-        <w:t>A. Height and width</w:t>
+        <w:t>○  A. Height and width</w:t>
       </w:r>
     </w:p>
     <w:p>
@@ -866,7 +866,7 @@
           <w:rFonts w:ascii="Times New Roman" w:hAnsi="Times New Roman"/>
           <w:sz w:val="24"/>
         </w:rPr>
-        <w:t>B. Red, Green, and Blue color channels</w:t>
+        <w:t>○  B. Red, Green, and Blue color channels</w:t>
       </w:r>
     </w:p>
     <w:p>
@@ -879,7 +879,7 @@
           <w:rFonts w:ascii="Times New Roman" w:hAnsi="Times New Roman"/>
           <w:sz w:val="24"/>
         </w:rPr>
-        <w:t>C. Alpha transparency channel</w:t>
+        <w:t>○  C. Alpha transparency channel</w:t>
       </w:r>
     </w:p>
     <w:p>
@@ -892,7 +892,7 @@
           <w:rFonts w:ascii="Times New Roman" w:hAnsi="Times New Roman"/>
           <w:sz w:val="24"/>
         </w:rPr>
-        <w:t>D. Pixel intensity</w:t>
+        <w:t>○  D. Pixel intensity</w:t>
       </w:r>
     </w:p>
     <w:p>
@@ -902,7 +902,7 @@
     </w:p>
     <w:p>
       <w:pPr>
-        <w:spacing w:after="40"/>
+        <w:spacing w:after="40" w:before="80"/>
       </w:pPr>
       <w:r>
         <w:rPr>
@@ -922,7 +922,7 @@
           <w:rFonts w:ascii="Times New Roman" w:hAnsi="Times New Roman"/>
           <w:sz w:val="24"/>
         </w:rPr>
-        <w:t>A. float64</w:t>
+        <w:t>○  A. float64</w:t>
       </w:r>
     </w:p>
     <w:p>
@@ -935,7 +935,7 @@
           <w:rFonts w:ascii="Times New Roman" w:hAnsi="Times New Roman"/>
           <w:sz w:val="24"/>
         </w:rPr>
-        <w:t>B. uint16</w:t>
+        <w:t>○  B. uint16</w:t>
       </w:r>
     </w:p>
     <w:p>
@@ -948,7 +948,7 @@
           <w:rFonts w:ascii="Times New Roman" w:hAnsi="Times New Roman"/>
           <w:sz w:val="24"/>
         </w:rPr>
-        <w:t>C. uint8</w:t>
+        <w:t>○  C. uint8</w:t>
       </w:r>
     </w:p>
     <w:p>
@@ -961,7 +961,7 @@
           <w:rFonts w:ascii="Times New Roman" w:hAnsi="Times New Roman"/>
           <w:sz w:val="24"/>
         </w:rPr>
-        <w:t>D. int32</w:t>
+        <w:t>○  D. int32</w:t>
       </w:r>
     </w:p>
     <w:p>
@@ -971,7 +971,7 @@
     </w:p>
     <w:p>
       <w:pPr>
-        <w:spacing w:after="40"/>
+        <w:spacing w:after="40" w:before="80"/>
       </w:pPr>
       <w:r>
         <w:rPr>
@@ -991,7 +991,7 @@
           <w:rFonts w:ascii="Times New Roman" w:hAnsi="Times New Roman"/>
           <w:sz w:val="24"/>
         </w:rPr>
-        <w:t>A. uint8</w:t>
+        <w:t>○  A. uint8</w:t>
       </w:r>
     </w:p>
     <w:p>
@@ -1004,7 +1004,7 @@
           <w:rFonts w:ascii="Times New Roman" w:hAnsi="Times New Roman"/>
           <w:sz w:val="24"/>
         </w:rPr>
-        <w:t>B. float64</w:t>
+        <w:t>○  B. float64</w:t>
       </w:r>
     </w:p>
     <w:p>
@@ -1017,7 +1017,7 @@
           <w:rFonts w:ascii="Times New Roman" w:hAnsi="Times New Roman"/>
           <w:sz w:val="24"/>
         </w:rPr>
-        <w:t>C. int16</w:t>
+        <w:t>○  C. int16</w:t>
       </w:r>
     </w:p>
     <w:p>
@@ -1030,7 +1030,7 @@
           <w:rFonts w:ascii="Times New Roman" w:hAnsi="Times New Roman"/>
           <w:sz w:val="24"/>
         </w:rPr>
-        <w:t>D. uint16</w:t>
+        <w:t>○  D. uint16</w:t>
       </w:r>
     </w:p>
     <w:p>
@@ -1040,7 +1040,7 @@
     </w:p>
     <w:p>
       <w:pPr>
-        <w:spacing w:after="40"/>
+        <w:spacing w:after="40" w:before="80"/>
       </w:pPr>
       <w:r>
         <w:rPr>
@@ -1060,7 +1060,7 @@
           <w:rFonts w:ascii="Times New Roman" w:hAnsi="Times New Roman"/>
           <w:sz w:val="24"/>
         </w:rPr>
-        <w:t>A. 0 to 65535</w:t>
+        <w:t>○  A. 0 to 65535</w:t>
       </w:r>
     </w:p>
     <w:p>
@@ -1073,7 +1073,7 @@
           <w:rFonts w:ascii="Times New Roman" w:hAnsi="Times New Roman"/>
           <w:sz w:val="24"/>
         </w:rPr>
-        <w:t>B. -128 to 127</w:t>
+        <w:t>○  B. -128 to 127</w:t>
       </w:r>
     </w:p>
     <w:p>
@@ -1086,7 +1086,7 @@
           <w:rFonts w:ascii="Times New Roman" w:hAnsi="Times New Roman"/>
           <w:sz w:val="24"/>
         </w:rPr>
-        <w:t>C. 0 to 255</w:t>
+        <w:t>○  C. 0 to 255</w:t>
       </w:r>
     </w:p>
     <w:p>
@@ -1099,7 +1099,7 @@
           <w:rFonts w:ascii="Times New Roman" w:hAnsi="Times New Roman"/>
           <w:sz w:val="24"/>
         </w:rPr>
-        <w:t>D. -1 to 1</w:t>
+        <w:t>○  D. -1 to 1</w:t>
       </w:r>
     </w:p>
     <w:p>
@@ -1109,7 +1109,7 @@
     </w:p>
     <w:p>
       <w:pPr>
-        <w:spacing w:after="40"/>
+        <w:spacing w:after="40" w:before="80"/>
       </w:pPr>
       <w:r>
         <w:rPr>
@@ -1129,7 +1129,7 @@
           <w:rFonts w:ascii="Times New Roman" w:hAnsi="Times New Roman"/>
           <w:sz w:val="24"/>
         </w:rPr>
-        <w:t>A. 0 to 255</w:t>
+        <w:t>○  A. 0 to 255</w:t>
       </w:r>
     </w:p>
     <w:p>
@@ -1142,7 +1142,7 @@
           <w:rFonts w:ascii="Times New Roman" w:hAnsi="Times New Roman"/>
           <w:sz w:val="24"/>
         </w:rPr>
-        <w:t>B. -1 to 1</w:t>
+        <w:t>○  B. -1 to 1</w:t>
       </w:r>
     </w:p>
     <w:p>
@@ -1155,7 +1155,7 @@
           <w:rFonts w:ascii="Times New Roman" w:hAnsi="Times New Roman"/>
           <w:sz w:val="24"/>
         </w:rPr>
-        <w:t>C. 0 to 65535</w:t>
+        <w:t>○  C. 0 to 65535</w:t>
       </w:r>
     </w:p>
     <w:p>
@@ -1168,7 +1168,7 @@
           <w:rFonts w:ascii="Times New Roman" w:hAnsi="Times New Roman"/>
           <w:sz w:val="24"/>
         </w:rPr>
-        <w:t>D. -128 to 127</w:t>
+        <w:t>○  D. -128 to 127</w:t>
       </w:r>
     </w:p>
     <w:p>
@@ -1178,7 +1178,7 @@
     </w:p>
     <w:p>
       <w:pPr>
-        <w:spacing w:after="40"/>
+        <w:spacing w:after="40" w:before="80"/>
       </w:pPr>
       <w:r>
         <w:rPr>
@@ -1198,7 +1198,7 @@
           <w:rFonts w:ascii="Times New Roman" w:hAnsi="Times New Roman"/>
           <w:sz w:val="24"/>
         </w:rPr>
-        <w:t>A. astype(float)</w:t>
+        <w:t>○  A. astype(float)</w:t>
       </w:r>
     </w:p>
     <w:p>
@@ -1211,7 +1211,7 @@
           <w:rFonts w:ascii="Times New Roman" w:hAnsi="Times New Roman"/>
           <w:sz w:val="24"/>
         </w:rPr>
-        <w:t>B. img_as_float()</w:t>
+        <w:t>○  B. img_as_float()</w:t>
       </w:r>
     </w:p>
     <w:p>
@@ -1224,7 +1224,7 @@
           <w:rFonts w:ascii="Times New Roman" w:hAnsi="Times New Roman"/>
           <w:sz w:val="24"/>
         </w:rPr>
-        <w:t>C. float_convert()</w:t>
+        <w:t>○  C. float_convert()</w:t>
       </w:r>
     </w:p>
     <w:p>
@@ -1237,7 +1237,7 @@
           <w:rFonts w:ascii="Times New Roman" w:hAnsi="Times New Roman"/>
           <w:sz w:val="24"/>
         </w:rPr>
-        <w:t>D. to_float()</w:t>
+        <w:t>○  D. to_float()</w:t>
       </w:r>
     </w:p>
     <w:p>
@@ -1247,7 +1247,7 @@
     </w:p>
     <w:p>
       <w:pPr>
-        <w:spacing w:after="40"/>
+        <w:spacing w:after="40" w:before="80"/>
       </w:pPr>
       <w:r>
         <w:rPr>
@@ -1267,7 +1267,7 @@
           <w:rFonts w:ascii="Times New Roman" w:hAnsi="Times New Roman"/>
           <w:sz w:val="24"/>
         </w:rPr>
-        <w:t>A. Unsigned 16-bit integer</w:t>
+        <w:t>○  A. Unsigned 16-bit integer</w:t>
       </w:r>
     </w:p>
     <w:p>
@@ -1280,7 +1280,7 @@
           <w:rFonts w:ascii="Times New Roman" w:hAnsi="Times New Roman"/>
           <w:sz w:val="24"/>
         </w:rPr>
-        <w:t>B. Floating-point</w:t>
+        <w:t>○  B. Floating-point</w:t>
       </w:r>
     </w:p>
     <w:p>
@@ -1293,7 +1293,7 @@
           <w:rFonts w:ascii="Times New Roman" w:hAnsi="Times New Roman"/>
           <w:sz w:val="24"/>
         </w:rPr>
-        <w:t>C. 8-bit unsigned integer</w:t>
+        <w:t>○  C. 8-bit unsigned integer</w:t>
       </w:r>
     </w:p>
     <w:p>
@@ -1306,7 +1306,7 @@
           <w:rFonts w:ascii="Times New Roman" w:hAnsi="Times New Roman"/>
           <w:sz w:val="24"/>
         </w:rPr>
-        <w:t>D. Signed 32-bit integer</w:t>
+        <w:t>○  D. Signed 32-bit integer</w:t>
       </w:r>
     </w:p>
     <w:p>
@@ -1316,7 +1316,7 @@
     </w:p>
     <w:p>
       <w:pPr>
-        <w:spacing w:after="40"/>
+        <w:spacing w:after="40" w:before="80"/>
       </w:pPr>
       <w:r>
         <w:rPr>
@@ -1336,7 +1336,7 @@
           <w:rFonts w:ascii="Times New Roman" w:hAnsi="Times New Roman"/>
           <w:sz w:val="24"/>
         </w:rPr>
-        <w:t>A. io.list_plugins()</w:t>
+        <w:t>○  A. io.list_plugins()</w:t>
       </w:r>
     </w:p>
     <w:p>
@@ -1349,7 +1349,7 @@
           <w:rFonts w:ascii="Times New Roman" w:hAnsi="Times New Roman"/>
           <w:sz w:val="24"/>
         </w:rPr>
-        <w:t>B. io.find_available_plugins()</w:t>
+        <w:t>○  B. io.find_available_plugins()</w:t>
       </w:r>
     </w:p>
     <w:p>
@@ -1362,7 +1362,7 @@
           <w:rFonts w:ascii="Times New Roman" w:hAnsi="Times New Roman"/>
           <w:sz w:val="24"/>
         </w:rPr>
-        <w:t>C. io.get_plugins()</w:t>
+        <w:t>○  C. io.get_plugins()</w:t>
       </w:r>
     </w:p>
     <w:p>
@@ -1375,7 +1375,7 @@
           <w:rFonts w:ascii="Times New Roman" w:hAnsi="Times New Roman"/>
           <w:sz w:val="24"/>
         </w:rPr>
-        <w:t>D. io.show_plugins()</w:t>
+        <w:t>○  D. io.show_plugins()</w:t>
       </w:r>
     </w:p>
     <w:p>
@@ -1385,7 +1385,7 @@
     </w:p>
     <w:p>
       <w:pPr>
-        <w:spacing w:after="40"/>
+        <w:spacing w:after="40" w:before="80"/>
       </w:pPr>
       <w:r>
         <w:rPr>
@@ -1405,7 +1405,7 @@
           <w:rFonts w:ascii="Times New Roman" w:hAnsi="Times New Roman"/>
           <w:sz w:val="24"/>
         </w:rPr>
-        <w:t>A. io.set_plugin()</w:t>
+        <w:t>○  A. io.set_plugin()</w:t>
       </w:r>
     </w:p>
     <w:p>
@@ -1418,7 +1418,7 @@
           <w:rFonts w:ascii="Times New Roman" w:hAnsi="Times New Roman"/>
           <w:sz w:val="24"/>
         </w:rPr>
-        <w:t>B. io.default_plugin()</w:t>
+        <w:t>○  B. io.default_plugin()</w:t>
       </w:r>
     </w:p>
     <w:p>
@@ -1431,7 +1431,7 @@
           <w:rFonts w:ascii="Times New Roman" w:hAnsi="Times New Roman"/>
           <w:sz w:val="24"/>
         </w:rPr>
-        <w:t>C. io.use_plugin()</w:t>
+        <w:t>○  C. io.use_plugin()</w:t>
       </w:r>
     </w:p>
     <w:p>
@@ -1444,7 +1444,7 @@
           <w:rFonts w:ascii="Times New Roman" w:hAnsi="Times New Roman"/>
           <w:sz w:val="24"/>
         </w:rPr>
-        <w:t>D. io.load_plugin()</w:t>
+        <w:t>○  D. io.load_plugin()</w:t>
       </w:r>
     </w:p>
     <w:p>
@@ -1472,7 +1472,7 @@
     </w:p>
     <w:p>
       <w:pPr>
-        <w:spacing w:after="240"/>
+        <w:spacing w:after="120"/>
       </w:pPr>
       <w:r>
         <w:rPr>
@@ -2037,312 +2037,9 @@
         <w:t xml:space="preserve">Overall Total Score: _______ </w:t>
       </w:r>
     </w:p>
-    <w:p>
-      <w:pPr>
-        <w:spacing w:after="240"/>
-      </w:pPr>
-      <w:r>
-        <w:rPr>
-          <w:rFonts w:ascii="Times New Roman" w:hAnsi="Times New Roman"/>
-          <w:b w:val="0"/>
-          <w:sz w:val="24"/>
-        </w:rPr>
-        <w:t>======================================================================</w:t>
-      </w:r>
-    </w:p>
-    <w:p>
-      <w:pPr>
-        <w:pStyle w:val="Heading2"/>
-        <w:jc w:val="center"/>
-      </w:pPr>
-      <w:r>
-        <w:rPr>
-          <w:rFonts w:ascii="Times New Roman" w:hAnsi="Times New Roman"/>
-          <w:color w:val="000000"/>
-        </w:rPr>
-        <w:t>ANSWER KEY</w:t>
-      </w:r>
-    </w:p>
-    <w:p>
-      <w:pPr>
-        <w:spacing w:after="160"/>
-      </w:pPr>
-      <w:r>
-        <w:rPr>
-          <w:rFonts w:ascii="Times New Roman" w:hAnsi="Times New Roman"/>
-          <w:b/>
-          <w:sz w:val="24"/>
-        </w:rPr>
-        <w:t>Part I — Multiple Choice</w:t>
-      </w:r>
-    </w:p>
-    <w:tbl>
-      <w:tblPr>
-        <w:tblW w:type="auto" w:w="0"/>
-        <w:tblLook w:firstColumn="1" w:firstRow="1" w:lastColumn="0" w:lastRow="0" w:noHBand="0" w:noVBand="1" w:val="04A0"/>
-      </w:tblPr>
-      <w:tblGrid>
-        <w:gridCol w:w="4320"/>
-        <w:gridCol w:w="4320"/>
-      </w:tblGrid>
-      <w:tr>
-        <w:tc>
-          <w:tcPr>
-            <w:tcW w:type="dxa" w:w="4320"/>
-          </w:tcPr>
-          <w:p/>
-          <w:p>
-            <w:pPr>
-              <w:spacing w:after="40"/>
-            </w:pPr>
-            <w:r>
-              <w:rPr>
-                <w:rFonts w:ascii="Times New Roman" w:hAnsi="Times New Roman"/>
-                <w:sz w:val="24"/>
-              </w:rPr>
-              <w:t>1. A</w:t>
-            </w:r>
-          </w:p>
-          <w:p>
-            <w:pPr>
-              <w:spacing w:after="40"/>
-            </w:pPr>
-            <w:r>
-              <w:rPr>
-                <w:rFonts w:ascii="Times New Roman" w:hAnsi="Times New Roman"/>
-                <w:sz w:val="24"/>
-              </w:rPr>
-              <w:t>2. B</w:t>
-            </w:r>
-          </w:p>
-          <w:p>
-            <w:pPr>
-              <w:spacing w:after="40"/>
-            </w:pPr>
-            <w:r>
-              <w:rPr>
-                <w:rFonts w:ascii="Times New Roman" w:hAnsi="Times New Roman"/>
-                <w:sz w:val="24"/>
-              </w:rPr>
-              <w:t>3. B</w:t>
-            </w:r>
-          </w:p>
-          <w:p>
-            <w:pPr>
-              <w:spacing w:after="40"/>
-            </w:pPr>
-            <w:r>
-              <w:rPr>
-                <w:rFonts w:ascii="Times New Roman" w:hAnsi="Times New Roman"/>
-                <w:sz w:val="24"/>
-              </w:rPr>
-              <w:t>4. C</w:t>
-            </w:r>
-          </w:p>
-          <w:p>
-            <w:pPr>
-              <w:spacing w:after="40"/>
-            </w:pPr>
-            <w:r>
-              <w:rPr>
-                <w:rFonts w:ascii="Times New Roman" w:hAnsi="Times New Roman"/>
-                <w:sz w:val="24"/>
-              </w:rPr>
-              <w:t>5. B</w:t>
-            </w:r>
-          </w:p>
-          <w:p>
-            <w:pPr>
-              <w:spacing w:after="40"/>
-            </w:pPr>
-            <w:r>
-              <w:rPr>
-                <w:rFonts w:ascii="Times New Roman" w:hAnsi="Times New Roman"/>
-                <w:sz w:val="24"/>
-              </w:rPr>
-              <w:t>6. C</w:t>
-            </w:r>
-          </w:p>
-          <w:p>
-            <w:pPr>
-              <w:spacing w:after="40"/>
-            </w:pPr>
-            <w:r>
-              <w:rPr>
-                <w:rFonts w:ascii="Times New Roman" w:hAnsi="Times New Roman"/>
-                <w:sz w:val="24"/>
-              </w:rPr>
-              <w:t>7. B</w:t>
-            </w:r>
-          </w:p>
-          <w:p>
-            <w:pPr>
-              <w:spacing w:after="40"/>
-            </w:pPr>
-            <w:r>
-              <w:rPr>
-                <w:rFonts w:ascii="Times New Roman" w:hAnsi="Times New Roman"/>
-                <w:sz w:val="24"/>
-              </w:rPr>
-              <w:t>8. C</w:t>
-            </w:r>
-          </w:p>
-          <w:p>
-            <w:pPr>
-              <w:spacing w:after="40"/>
-            </w:pPr>
-            <w:r>
-              <w:rPr>
-                <w:rFonts w:ascii="Times New Roman" w:hAnsi="Times New Roman"/>
-                <w:sz w:val="24"/>
-              </w:rPr>
-              <w:t>9. B</w:t>
-            </w:r>
-          </w:p>
-          <w:p>
-            <w:pPr>
-              <w:spacing w:after="40"/>
-            </w:pPr>
-            <w:r>
-              <w:rPr>
-                <w:rFonts w:ascii="Times New Roman" w:hAnsi="Times New Roman"/>
-                <w:sz w:val="24"/>
-              </w:rPr>
-              <w:t>10. C</w:t>
-            </w:r>
-          </w:p>
-        </w:tc>
-        <w:tc>
-          <w:tcPr>
-            <w:tcW w:type="dxa" w:w="4320"/>
-          </w:tcPr>
-          <w:p/>
-          <w:p>
-            <w:pPr>
-              <w:spacing w:after="40"/>
-            </w:pPr>
-            <w:r>
-              <w:rPr>
-                <w:rFonts w:ascii="Times New Roman" w:hAnsi="Times New Roman"/>
-                <w:sz w:val="24"/>
-              </w:rPr>
-              <w:t>11. B</w:t>
-            </w:r>
-          </w:p>
-          <w:p>
-            <w:pPr>
-              <w:spacing w:after="40"/>
-            </w:pPr>
-            <w:r>
-              <w:rPr>
-                <w:rFonts w:ascii="Times New Roman" w:hAnsi="Times New Roman"/>
-                <w:sz w:val="24"/>
-              </w:rPr>
-              <w:t>12. B</w:t>
-            </w:r>
-          </w:p>
-          <w:p>
-            <w:pPr>
-              <w:spacing w:after="40"/>
-            </w:pPr>
-            <w:r>
-              <w:rPr>
-                <w:rFonts w:ascii="Times New Roman" w:hAnsi="Times New Roman"/>
-                <w:sz w:val="24"/>
-              </w:rPr>
-              <w:t>13. C</w:t>
-            </w:r>
-          </w:p>
-          <w:p>
-            <w:pPr>
-              <w:spacing w:after="40"/>
-            </w:pPr>
-            <w:r>
-              <w:rPr>
-                <w:rFonts w:ascii="Times New Roman" w:hAnsi="Times New Roman"/>
-                <w:sz w:val="24"/>
-              </w:rPr>
-              <w:t>14. B</w:t>
-            </w:r>
-          </w:p>
-          <w:p>
-            <w:pPr>
-              <w:spacing w:after="40"/>
-            </w:pPr>
-            <w:r>
-              <w:rPr>
-                <w:rFonts w:ascii="Times New Roman" w:hAnsi="Times New Roman"/>
-                <w:sz w:val="24"/>
-              </w:rPr>
-              <w:t>15. C</w:t>
-            </w:r>
-          </w:p>
-          <w:p>
-            <w:pPr>
-              <w:spacing w:after="40"/>
-            </w:pPr>
-            <w:r>
-              <w:rPr>
-                <w:rFonts w:ascii="Times New Roman" w:hAnsi="Times New Roman"/>
-                <w:sz w:val="24"/>
-              </w:rPr>
-              <w:t>16. B</w:t>
-            </w:r>
-          </w:p>
-          <w:p>
-            <w:pPr>
-              <w:spacing w:after="40"/>
-            </w:pPr>
-            <w:r>
-              <w:rPr>
-                <w:rFonts w:ascii="Times New Roman" w:hAnsi="Times New Roman"/>
-                <w:sz w:val="24"/>
-              </w:rPr>
-              <w:t>17. B</w:t>
-            </w:r>
-          </w:p>
-          <w:p>
-            <w:pPr>
-              <w:spacing w:after="40"/>
-            </w:pPr>
-            <w:r>
-              <w:rPr>
-                <w:rFonts w:ascii="Times New Roman" w:hAnsi="Times New Roman"/>
-                <w:sz w:val="24"/>
-              </w:rPr>
-              <w:t>18. C</w:t>
-            </w:r>
-          </w:p>
-          <w:p>
-            <w:pPr>
-              <w:spacing w:after="40"/>
-            </w:pPr>
-            <w:r>
-              <w:rPr>
-                <w:rFonts w:ascii="Times New Roman" w:hAnsi="Times New Roman"/>
-                <w:sz w:val="24"/>
-              </w:rPr>
-              <w:t>19. B</w:t>
-            </w:r>
-          </w:p>
-          <w:p>
-            <w:pPr>
-              <w:spacing w:after="40"/>
-            </w:pPr>
-            <w:r>
-              <w:rPr>
-                <w:rFonts w:ascii="Times New Roman" w:hAnsi="Times New Roman"/>
-                <w:sz w:val="24"/>
-              </w:rPr>
-              <w:t>20. C</w:t>
-            </w:r>
-          </w:p>
-        </w:tc>
-      </w:tr>
-    </w:tbl>
     <w:sectPr>
       <w:pgSz w:w="12240" w:h="15840"/>
-      <w:pgMar w:top="1440" w:right="1800" w:bottom="1440" w:left="1800" w:header="720" w:footer="720" w:gutter="0"/>
+      <w:pgMar w:top="1152" w:right="1800" w:bottom="1152" w:left="1800" w:header="720" w:footer="720" w:gutter="0"/>
       <w:cols w:space="720"/>
       <w:docGrid w:linePitch="360"/>
     </w:sectPr>

</xml_diff>